<commit_message>
docs: manual v3.2 (signing v2, broadcast, custom fields, meetings, live rooms) + project status & setup checklist
- AWIVEST-Investor-Portal-Manual.docx: new section 9 (Signing and live meetings) + v3.2 changelog appendix; Glossary renumbered to 10.
- docs/PROJECT-STATUS-AND-SETUP.md: what the system does per role, what was built, and every remaining setup step.
</commit_message>
<xml_diff>
--- a/AWIVEST-Investor-Portal-Manual.docx
+++ b/AWIVEST-Investor-Portal-Manual.docx
@@ -2388,7 +2388,156 @@
         <w:pStyle w:val="Heading1"/>
       </w:pPr>
       <w:r>
-        <w:t>9. Glossary</w:t>
+        <w:t>9. Signing and live meetings (added in version 3.2)</w:t>
+      </w:r>
+    </w:p>
+    <w:p>
+      <w:r>
+        <w:t>Version 3.2 adds ordered multi-party document signing, the ability to send a document to many members at once, custom fill-in fields, meeting video links, and live meetings hosted inside the portal.</w:t>
+      </w:r>
+    </w:p>
+    <w:p>
+      <w:pPr>
+        <w:pStyle w:val="Heading2"/>
+      </w:pPr>
+      <w:r>
+        <w:t>9.1 Documents to Sign - two ways to sign</w:t>
+      </w:r>
+    </w:p>
+    <w:p>
+      <w:r>
+        <w:t>The portal now supports two signing flows, side by side:</w:t>
+      </w:r>
+    </w:p>
+    <w:p>
+      <w:pPr>
+        <w:pStyle w:val="ListBullet"/>
+      </w:pPr>
+      <w:r>
+        <w:t>Individual (unchanged): the member signs and an Admin or the Chairlady countersigns - used for enrollment, claims, exit and similar two-party forms.</w:t>
+      </w:r>
+    </w:p>
+    <w:p>
+      <w:pPr>
+        <w:pStyle w:val="ListBullet"/>
+      </w:pPr>
+      <w:r>
+        <w:t>Sequential (ordered): the document is signed by several people in a set order, for example Investor, then Secretary, then Treasurer, then Chairlady. Each person signs on their turn, the document automatically moves to the next signer with a notification and email, and when the last person signs it is marked Complete and the fully-signed PDF becomes downloadable.</w:t>
+      </w:r>
+    </w:p>
+    <w:p>
+      <w:pPr>
+        <w:pStyle w:val="Heading3"/>
+      </w:pPr>
+      <w:r>
+        <w:t>Creating a sequential document (Admin / Chairlady)</w:t>
+      </w:r>
+    </w:p>
+    <w:p>
+      <w:r>
+        <w:t>On the Staff Console, open Documents to Sign and choose the sequential option. Export your Word document to PDF first (File &gt; Save As or Export &gt; PDF) so the layout, tables and fonts are preserved exactly, then upload that PDF. Build the order of signers and send.</w:t>
+      </w:r>
+    </w:p>
+    <w:p>
+      <w:pPr>
+        <w:pStyle w:val="Heading3"/>
+      </w:pPr>
+      <w:r>
+        <w:t>Signing your turn</w:t>
+      </w:r>
+    </w:p>
+    <w:p>
+      <w:r>
+        <w:t>Office holders (Secretary, Treasurer, Chairlady) sign from the Awaiting your signature section of the Staff Console. Investors sign from their member portal under Documents to Sign. Signing captures your name, the date, and your drawn or uploaded signature. You can only sign when it is your turn.</w:t>
+      </w:r>
+    </w:p>
+    <w:p>
+      <w:pPr>
+        <w:pStyle w:val="Heading2"/>
+      </w:pPr>
+      <w:r>
+        <w:t>9.2 Custom fill-in fields</w:t>
+      </w:r>
+    </w:p>
+    <w:p>
+      <w:r>
+        <w:t>When building a sequential document, the Admin can add custom fields for any signer - for example an ID number, an amount, or a position or title. Each field has a label, a type (Text or Date), and can be marked required. When it is that person's turn, they complete their fields along with their signature; required fields must be filled before they can submit. The completed values are printed on the signature certificate attached to the final PDF.</w:t>
+      </w:r>
+    </w:p>
+    <w:p>
+      <w:pPr>
+        <w:pStyle w:val="Heading2"/>
+      </w:pPr>
+      <w:r>
+        <w:t>9.3 Send to one member, selected members, or everyone</w:t>
+      </w:r>
+    </w:p>
+    <w:p>
+      <w:r>
+        <w:t>When you send a sequential document you choose the first signer:</w:t>
+      </w:r>
+    </w:p>
+    <w:p>
+      <w:pPr>
+        <w:pStyle w:val="ListBullet"/>
+      </w:pPr>
+      <w:r>
+        <w:t>All active members - every active member receives their own copy that runs through the full signing order. The staff list shows a single card with an M of N members completed progress bar.</w:t>
+      </w:r>
+    </w:p>
+    <w:p>
+      <w:pPr>
+        <w:pStyle w:val="ListBullet"/>
+      </w:pPr>
+      <w:r>
+        <w:t>Selected members - the same, but only for the members you pick.</w:t>
+      </w:r>
+    </w:p>
+    <w:p>
+      <w:pPr>
+        <w:pStyle w:val="ListBullet"/>
+      </w:pPr>
+      <w:r>
+        <w:t>A specific person - a single document for one named signer.</w:t>
+      </w:r>
+    </w:p>
+    <w:p>
+      <w:pPr>
+        <w:pStyle w:val="Heading2"/>
+      </w:pPr>
+      <w:r>
+        <w:t>9.4 Meeting video links</w:t>
+      </w:r>
+    </w:p>
+    <w:p>
+      <w:r>
+        <w:t>Staff can attach a Zoom or Google Meet link (with an optional passcode) to any meeting, and publish the meeting to members using the Show to members toggle. Published meetings appear on a new member Meetings page - upcoming and past - each with a Join button. Committee and governance meetings stay staff-only unless you publish them.</w:t>
+      </w:r>
+    </w:p>
+    <w:p>
+      <w:pPr>
+        <w:pStyle w:val="Heading2"/>
+      </w:pPr>
+      <w:r>
+        <w:t>9.5 Live meetings hosted in the portal</w:t>
+      </w:r>
+    </w:p>
+    <w:p>
+      <w:r>
+        <w:t>The portal can now host a live video and audio meeting inside the app - no Zoom or Google Meet account required. On a meeting, staff click Create live room; staff and (for published meetings) members then join the room embedded in the portal. Meetings can be recorded to the cloud; recordings are listed afterwards with download links.</w:t>
+      </w:r>
+    </w:p>
+    <w:p>
+      <w:r>
+        <w:t>Note: live rooms require the administrator to configure the video service key (DAILY_API_KEY). Until that is set, the Create live room button is shown but disabled.</w:t>
+      </w:r>
+    </w:p>
+    <w:p>
+      <w:pPr>
+        <w:pStyle w:val="Heading1"/>
+      </w:pPr>
+      <w:r>
+        <w:t>10. Glossary</w:t>
       </w:r>
     </w:p>
     <w:p>
@@ -2473,6 +2622,69 @@
       </w:r>
       <w:r>
         <w:t>paying money out — a withdrawal, refund or welfare payment; reserved for Admin and Chairlady.</w:t>
+      </w:r>
+    </w:p>
+    <w:p>
+      <w:pPr>
+        <w:pStyle w:val="Heading2"/>
+      </w:pPr>
+      <w:r>
+        <w:t>Appendix - What changed in version 3.2</w:t>
+      </w:r>
+    </w:p>
+    <w:p>
+      <w:r>
+        <w:t>Signing</w:t>
+      </w:r>
+    </w:p>
+    <w:p>
+      <w:pPr>
+        <w:pStyle w:val="ListBullet"/>
+      </w:pPr>
+      <w:r>
+        <w:t>Documents to Sign v2: sequential (ordered) signing, for example Investor, Secretary, Treasurer, Chairlady, alongside the existing individual flow.</w:t>
+      </w:r>
+    </w:p>
+    <w:p>
+      <w:pPr>
+        <w:pStyle w:val="ListBullet"/>
+      </w:pPr>
+      <w:r>
+        <w:t>Broadcast a signing document to all active members or a selected list; each member runs the full order and the staff view shows batch progress.</w:t>
+      </w:r>
+    </w:p>
+    <w:p>
+      <w:pPr>
+        <w:pStyle w:val="ListBullet"/>
+      </w:pPr>
+      <w:r>
+        <w:t>Custom fill-in fields per signer (Text or Date, optional or required); values appear on the signature certificate.</w:t>
+      </w:r>
+    </w:p>
+    <w:p>
+      <w:r>
+        <w:t>Meetings</w:t>
+      </w:r>
+    </w:p>
+    <w:p>
+      <w:pPr>
+        <w:pStyle w:val="ListBullet"/>
+      </w:pPr>
+      <w:r>
+        <w:t>Attach Zoom or Google Meet links (and a passcode) to meetings and publish them to members; new member Meetings page with Join buttons.</w:t>
+      </w:r>
+    </w:p>
+    <w:p>
+      <w:pPr>
+        <w:pStyle w:val="ListBullet"/>
+      </w:pPr>
+      <w:r>
+        <w:t>Live meetings hosted inside the portal with cloud recording (requires the video service key to be configured).</w:t>
+      </w:r>
+    </w:p>
+    <w:p>
+      <w:r>
+        <w:t>Behind the scenes: database migrations 20260913130000, 20260913140000, 20260913150000, 20260913160000 and 20260914010000.</w:t>
       </w:r>
     </w:p>
     <w:p>

</xml_diff>